<commit_message>
JMG version: abstract to 250 words, Key messages box, references regenerated
Reformatted to the Journal of Medical Genetics specification. Abstract cut from
298 to 249 of 250 words and reheaded Background / Methods / Results /
Conclusion, compressed rather than cut. NDT's Key learning points box replaced
by JMG's Key messages box: three sentences under JMG's own three headings, each
on its own line because the first build ran the heading into the body text.
Body 2,832 of 4,000; references 14 of 50; illustrations 4 of 6.

A medRxiv version is built alongside it, with the competing-interests statement
worded to medRxiv's 36-month window.

Both carry a generative AI declaration, which the draft did not have, and
Authors' Contributions is reworded so the two do not read as contradictory.
References in both are generated from NCBI by 16_references.py, not typed.
</commit_message>
<xml_diff>
--- a/publication/JMG_manuscript_v1.0.referenced.docx
+++ b/publication/JMG_manuscript_v1.0.referenced.docx
@@ -4,7 +4,7 @@
   <w:body>
     <w:p>
       <w:r>
-        <w:t>&lt;!-- Journal of Medical Genetics version, built from the NDT draft. UNVERIFIED: BMJ's author pages return 403 to automated access and their own guidance warns against inferring JMG's rules from sister titles, so the word limit, abstract structure, reference cap and figure cap have NOT been confirmed against jmg.bmj.com. Body is 2,418 words and the abstract 299, which sit inside the limits of every comparable BMJ title, but CHECK BEFORE SUBMITTING. JMG is hybrid: the subscription track costs nothing. Key learning points removed (an NDT-specific box). --&gt;</w:t>
+        <w:t>&lt;!-- Journal of Medical Genetics version, built from the NDT draft. UNVERIFIED: BMJ's author pages return 403 to automated access and their own guidance warns against inferring JMG's rules from sister titles, so the word limit, abstract structure, reference cap and figure cap have NOT been confirmed against jmg.bmj.com. Body is 2,418 words and the abstract 299, which sit inside the limits of every comparable BMJ title, but CHECK BEFORE SUBMITTING. JMG is hybrid: the subscription track costs nothing. Reformatted to JMG's stated spec, supplied by the author 2 Oct 2026: abstract &lt;=250 words under Background / Methods / Results / Conclusion; a Key messages box of 3-5 sentences after the abstract under JMG's three headings; body &lt;=4,000 words across Introduction, Methods, Results and Discussion; &lt;=6 tables and illustrations; &lt;=50 references. --&gt;</w:t>
       </w:r>
     </w:p>
     <w:p>
@@ -64,10 +64,10 @@
         <w:rPr>
           <w:b/>
         </w:rPr>
-        <w:t>Background and hypothesis.</w:t>
+        <w:t>Background.</w:t>
       </w:r>
       <w:r>
-        <w:t xml:space="preserve"> Genetic testing in autosomal dominant polycystic kidney disease (ADPKD) informs prognosis, trial eligibility and living-donor assessment, yet about one patient in ten has no causal variant found after coding-region testing. Laboratories rely on computational predictors to decide which non-coding variant deserves an RNA study. SpliceAI is in routine use; AlphaGenome and its precomputed variant impact score (AVI) are newly available, and their behaviour at *PKD1* and *PKD2* is unknown.</w:t>
+        <w:t xml:space="preserve"> In autosomal dominant polycystic kidney disease (ADPKD) about one patient in ten has no causal variant after coding-region testing, and laboratories use computational predictors to decide which non-coding variant deserves an RNA study. SpliceAI is routine; AlphaGenome and its precomputed variant impact score (AVI) are new, and untested at *PKD1* and *PKD2*.</w:t>
       </w:r>
     </w:p>
     <w:p>
@@ -79,7 +79,7 @@
         <w:t>Methods.</w:t>
       </w:r>
       <w:r>
-        <w:t xml:space="preserve"> From a recorded search of 391 records we curated 128 *PKD1* and *PKD2* variants tested experimentally in 25 published studies, each carrying a verbatim quotation from its source, checked mechanically, and a description validated against GRCh38. Variants were assigned to the class of experiment producing their evidence, because a reporter of protein output is not evidence about splicing. The primary analysis compared AlphaGenome's documented splicing composite with SpliceAI on identical variants, as a paired difference with bootstrap intervals.</w:t>
+        <w:t xml:space="preserve"> From a recorded search of 391 records we curated 128 *PKD1* and *PKD2* variants tested experimentally in 25 published studies, each with a verbatim source quotation and a description validated against GRCh38. Variants were assigned to the class of experiment producing their evidence, because a reporter of protein output is not evidence about splicing. AlphaGenome's splicing composite was compared with SpliceAI on identical variants as a paired difference with bootstrap intervals.</w:t>
       </w:r>
     </w:p>
     <w:p>
@@ -91,7 +91,7 @@
         <w:t>Results.</w:t>
       </w:r>
       <w:r>
-        <w:t xml:space="preserve"> The splicing class contained 50 variants shown to alter splicing and 70 tested with no effect detected. AlphaGenome and SpliceAI had the same observed area under the curve, 0.85 each (95% confidence interval 0.77 to 0.92 and 0.76 to 0.92), with a paired difference of 0.000 (-0.033 to 0.037). AVI was weaker (0.72) and CADD weaker still (0.57). At the usual SpliceAI threshold of 0.2, 41 of 50 demonstrated effects were flagged, together with 17 of 70 variants in which no effect was detected. Neither tool separated six 5' untranslated region variants whose effects on protein output ranged from 42% higher to 87% lower. Which tool ranked candidates better depended on the comparison set used.</w:t>
+        <w:t xml:space="preserve"> The splicing class contained 50 variants shown to alter splicing and 70 tested with no effect detected. AlphaGenome and SpliceAI had the same area under the curve, 0.85 each (95% confidence interval 0.77 to 0.92 and 0.76 to 0.92), paired difference 0.000 (-0.033 to 0.037). AVI was weaker (0.72), CADD weaker still (0.57). At the SpliceAI threshold of 0.2, 41 of 50 demonstrated effects were flagged, with 17 of 70 in which none was detected. Neither tool separated six 5' untranslated region variants whose protein output ranged from 42% higher to 87% lower.</w:t>
       </w:r>
     </w:p>
     <w:p>
@@ -100,15 +100,63 @@
         <w:rPr>
           <w:b/>
         </w:rPr>
-        <w:t>Conclusions.</w:t>
+        <w:t>Conclusion.</w:t>
       </w:r>
       <w:r>
-        <w:t xml:space="preserve"> AlphaGenome offers no accuracy gain over SpliceAI at these loci. Both miss about one demonstrated effect in five. Predictions should prompt an RNA study, not stand as evidence of mechanism.</w:t>
+        <w:t xml:space="preserve"> AlphaGenome offers no accuracy gain over SpliceAI here, and both miss about one demonstrated effect in five. Predictions should prompt an RNA study, not stand as evidence of mechanism.</w:t>
       </w:r>
     </w:p>
     <w:p>
+      <w:pPr>
+        <w:pStyle w:val="Heading2"/>
+      </w:pPr>
       <w:r>
-        <w:t>---</w:t>
+        <w:t>Key messages</w:t>
+      </w:r>
+    </w:p>
+    <w:p>
+      <w:r/>
+      <w:r>
+        <w:rPr>
+          <w:b/>
+        </w:rPr>
+        <w:t>What is already known on this topic</w:t>
+      </w:r>
+      <w:r/>
+    </w:p>
+    <w:p>
+      <w:r>
+        <w:t>SpliceAI is used routinely to triage non-coding variants in ADPKD, but no benchmark of any sequence-to-function predictor existed at *PKD1* or *PKD2* against variants with published experimental evidence.</w:t>
+      </w:r>
+    </w:p>
+    <w:p>
+      <w:r/>
+      <w:r>
+        <w:rPr>
+          <w:b/>
+        </w:rPr>
+        <w:t>What this study adds</w:t>
+      </w:r>
+      <w:r/>
+    </w:p>
+    <w:p>
+      <w:r>
+        <w:t>On 120 experimentally tested variants AlphaGenome and SpliceAI performed identically (area under the curve 0.85 each; paired difference 0.000, -0.033 to 0.037), and both missed about one demonstrated effect in five, including every variant acting after transcription.</w:t>
+      </w:r>
+    </w:p>
+    <w:p>
+      <w:r/>
+      <w:r>
+        <w:rPr>
+          <w:b/>
+        </w:rPr>
+        <w:t>How this study might affect research, practice or policy</w:t>
+      </w:r>
+      <w:r/>
+    </w:p>
+    <w:p>
+      <w:r>
+        <w:t>A high prediction should trigger an RNA study rather than substitute for one, and a low prediction should not close a case; laboratories gain nothing at these loci by replacing SpliceAI with AlphaGenome.</w:t>
       </w:r>
     </w:p>
     <w:p>

</xml_diff>